<commit_message>
pb version de base
</commit_message>
<xml_diff>
--- a/docs/cadrage/product-backlog version de base.docx
+++ b/docs/cadrage/product-backlog version de base.docx
@@ -1284,7 +1284,6 @@
                 <w:i/>
                 <w:color w:val="475569"/>
                 <w:spacing w:val="-1"/>
-                <w:lang w:val="en-US"/>
               </w:rPr>
             </w:pPr>
             <w:r>
@@ -1292,18 +1291,8 @@
                 <w:i/>
                 <w:color w:val="475569"/>
                 <w:spacing w:val="-1"/>
-                <w:lang w:val="en-US"/>
-              </w:rPr>
-              <w:t>Kyllian VIGNOCAN</w:t>
-            </w:r>
-            <w:r>
-              <w:rPr>
-                <w:i/>
-                <w:color w:val="475569"/>
-                <w:spacing w:val="-1"/>
-                <w:lang w:val="en-US"/>
-              </w:rPr>
-              <w:t>,</w:t>
+              </w:rPr>
+              <w:t>Kyllian VIGNOCAN,</w:t>
             </w:r>
             <w:r>
               <w:rPr>
@@ -1311,7 +1300,7 @@
                 <w:color w:val="FFFFFF"/>
                 <w:sz w:val="21"/>
                 <w:szCs w:val="21"/>
-                <w:lang w:val="en-US" w:eastAsia="fr-FR"/>
+                <w:lang w:eastAsia="fr-FR"/>
               </w:rPr>
               <w:t xml:space="preserve"> </w:t>
             </w:r>
@@ -1320,18 +1309,8 @@
                 <w:i/>
                 <w:color w:val="475569"/>
                 <w:spacing w:val="-1"/>
-                <w:lang w:val="en-US"/>
-              </w:rPr>
-              <w:t>Tom LAU</w:t>
-            </w:r>
-            <w:r>
-              <w:rPr>
-                <w:i/>
-                <w:color w:val="475569"/>
-                <w:spacing w:val="-1"/>
-                <w:lang w:val="en-US"/>
-              </w:rPr>
-              <w:t>,</w:t>
+              </w:rPr>
+              <w:t>Tom LAU,</w:t>
             </w:r>
             <w:r>
               <w:rPr>
@@ -1339,7 +1318,7 @@
                 <w:color w:val="FFFFFF"/>
                 <w:sz w:val="21"/>
                 <w:szCs w:val="21"/>
-                <w:lang w:val="en-US" w:eastAsia="fr-FR"/>
+                <w:lang w:eastAsia="fr-FR"/>
               </w:rPr>
               <w:t xml:space="preserve"> </w:t>
             </w:r>
@@ -1348,7 +1327,6 @@
                 <w:i/>
                 <w:color w:val="475569"/>
                 <w:spacing w:val="-1"/>
-                <w:lang w:val="en-US"/>
               </w:rPr>
               <w:t xml:space="preserve">Yacine </w:t>
             </w:r>
@@ -1358,25 +1336,14 @@
                 <w:i/>
                 <w:color w:val="475569"/>
                 <w:spacing w:val="-1"/>
-                <w:lang w:val="en-US"/>
-              </w:rPr>
-              <w:t>DJEBBOURI</w:t>
-            </w:r>
-            <w:r>
-              <w:rPr>
-                <w:i/>
-                <w:color w:val="475569"/>
-                <w:spacing w:val="-1"/>
-                <w:lang w:val="en-US"/>
-              </w:rPr>
-              <w:t xml:space="preserve"> </w:t>
+              </w:rPr>
+              <w:t xml:space="preserve">DJEBBOURI </w:t>
             </w:r>
             <w:r>
               <w:rPr>
                 <w:i/>
                 <w:color w:val="475569"/>
                 <w:spacing w:val="-10"/>
-                <w:lang w:val="en-US"/>
               </w:rPr>
               <w:t>]</w:t>
             </w:r>
@@ -1695,15 +1662,7 @@
                 <w:i/>
                 <w:color w:val="475569"/>
               </w:rPr>
-              <w:t>15h</w:t>
-            </w:r>
-            <w:proofErr w:type="gramStart"/>
-            <w:r>
-              <w:rPr>
-                <w:i/>
-                <w:color w:val="475569"/>
-              </w:rPr>
-              <w:t>23</w:t>
+              <w:t>15h30</w:t>
             </w:r>
             <w:r>
               <w:rPr>
@@ -1721,7 +1680,6 @@
               </w:rPr>
               <w:t>]</w:t>
             </w:r>
-            <w:proofErr w:type="gramEnd"/>
           </w:p>
         </w:tc>
       </w:tr>
@@ -6486,53 +6444,7 @@
                 <w:color w:val="1E1B4B"/>
                 <w:sz w:val="18"/>
               </w:rPr>
-              <w:t xml:space="preserve">, je veux générer un quiz de </w:t>
-            </w:r>
-            <w:proofErr w:type="gramStart"/>
-            <w:r>
-              <w:rPr>
-                <w:color w:val="1E1B4B"/>
-                <w:sz w:val="18"/>
-              </w:rPr>
-              <w:t xml:space="preserve">10 </w:t>
-            </w:r>
-            <w:r>
-              <w:rPr>
-                <w:color w:val="1E1B4B"/>
-                <w:sz w:val="18"/>
-              </w:rPr>
-              <w:t xml:space="preserve"> questions</w:t>
-            </w:r>
-            <w:proofErr w:type="gramEnd"/>
-            <w:r>
-              <w:rPr>
-                <w:color w:val="1E1B4B"/>
-                <w:sz w:val="18"/>
-              </w:rPr>
-              <w:t xml:space="preserve"> max à 4</w:t>
-            </w:r>
-            <w:proofErr w:type="gramStart"/>
-            <w:r>
-              <w:rPr>
-                <w:color w:val="1E1B4B"/>
-                <w:sz w:val="18"/>
-              </w:rPr>
-              <w:t>choix .</w:t>
-            </w:r>
-            <w:r>
-              <w:rPr>
-                <w:color w:val="1E1B4B"/>
-                <w:sz w:val="18"/>
-              </w:rPr>
-              <w:t>QCM</w:t>
-            </w:r>
-            <w:proofErr w:type="gramEnd"/>
-            <w:r>
-              <w:rPr>
-                <w:color w:val="1E1B4B"/>
-                <w:sz w:val="18"/>
-              </w:rPr>
-              <w:t xml:space="preserve"> en moins de 60 s, afin de réviser rapidement un </w:t>
+              <w:t xml:space="preserve">, je veux générer un quiz de 10 QCM en moins de 60 s, afin de réviser rapidement un </w:t>
             </w:r>
             <w:r>
               <w:rPr>
@@ -9278,41 +9190,13 @@
               </w:rPr>
               <w:t xml:space="preserve">, je veux générer des questions ouvertes corrigées par le LLM, afin de varier les types </w:t>
             </w:r>
-            <w:proofErr w:type="gramStart"/>
             <w:r>
               <w:rPr>
                 <w:color w:val="1E1B4B"/>
                 <w:spacing w:val="-2"/>
                 <w:sz w:val="18"/>
               </w:rPr>
-              <w:t>d'</w:t>
-            </w:r>
-            <w:proofErr w:type="spellStart"/>
-            <w:r>
-              <w:rPr>
-                <w:color w:val="1E1B4B"/>
-                <w:spacing w:val="-2"/>
-                <w:sz w:val="18"/>
-              </w:rPr>
-              <w:t>évaluation.</w:t>
-            </w:r>
-            <w:r>
-              <w:rPr>
-                <w:color w:val="1E1B4B"/>
-                <w:spacing w:val="-2"/>
-                <w:sz w:val="18"/>
-              </w:rPr>
-              <w:t>corrections</w:t>
-            </w:r>
-            <w:proofErr w:type="spellEnd"/>
-            <w:proofErr w:type="gramEnd"/>
-            <w:r>
-              <w:rPr>
-                <w:color w:val="1E1B4B"/>
-                <w:spacing w:val="-2"/>
-                <w:sz w:val="18"/>
-              </w:rPr>
-              <w:t xml:space="preserve"> simples.</w:t>
+              <w:t>d'évaluation.</w:t>
             </w:r>
           </w:p>
         </w:tc>
@@ -22463,6 +22347,7 @@
   <w:style w:type="character" w:default="1" w:styleId="DefaultParagraphFont">
     <w:name w:val="Default Paragraph Font"/>
     <w:uiPriority w:val="1"/>
+    <w:semiHidden/>
     <w:unhideWhenUsed/>
   </w:style>
   <w:style w:type="table" w:default="1" w:styleId="TableNormal">

</xml_diff>